<commit_message>
Tafelskript Fr 16.10.: Reflexionsteil (AVIVA, Direkte Instruktion, Differenzierung)
Co-Authored-By: Claude Opus 5.5 <noreply@anthropic.com>
Claude-Session: https://claude.ai/code/session_01KXvLXHMYPnCyEbMRgNaaYs
</commit_message>
<xml_diff>
--- a/Deutsch_7A/Balladen/Woche1/Tafelskript_Fr_16-10_Paddy_Fingal_Reime_Ur-Ei.docx
+++ b/Deutsch_7A/Balladen/Woche1/Tafelskript_Fr_16-10_Paddy_Fingal_Reime_Ur-Ei.docx
@@ -4556,9 +4556,824 @@
         <w:t xml:space="preserve"/>
       </w:r>
     </w:p>
+    <w:p>
+      <w:pPr>
+        <w:spacing w:after="100" w:before="0"/>
+      </w:pPr>
+      <w:r>
+        <w:br w:type="page"/>
+      </w:r>
+    </w:p>
+    <w:p>
+      <w:pPr>
+        <w:spacing w:after="20" w:before="0"/>
+      </w:pPr>
+      <w:r>
+        <w:rPr>
+          <w:rFonts w:ascii="Calibri" w:cs="Calibri" w:eastAsia="Calibri" w:hAnsi="Calibri"/>
+          <w:b/>
+          <w:bCs/>
+          <w:color w:val="5B6B8C"/>
+          <w:sz w:val="18"/>
+          <w:szCs w:val="18"/>
+        </w:rPr>
+        <w:t xml:space="preserve">FÜR DIE LEHRKRAFT · REFLEXION VOR UND NACH DER STUNDE</w:t>
+      </w:r>
+    </w:p>
+    <w:p>
+      <w:pPr>
+        <w:keepNext/>
+        <w:spacing w:after="60" w:before="120"/>
+      </w:pPr>
+      <w:r>
+        <w:rPr>
+          <w:rFonts w:ascii="Cambria" w:cs="Cambria" w:eastAsia="Cambria" w:hAnsi="Cambria"/>
+          <w:b/>
+          <w:bCs/>
+          <w:color w:val="1E2761"/>
+          <w:sz w:val="23"/>
+          <w:szCs w:val="23"/>
+        </w:rPr>
+        <w:t xml:space="preserve">Umsetzung der Erkenntnisse zur Unterrichtsverbesserung</w:t>
+      </w:r>
+    </w:p>
+    <w:tbl>
+      <w:tblPr>
+        <w:tblW w:type="dxa" w:w="10206"/>
+        <w:tblBorders>
+          <w:top w:val="single" w:color="auto" w:sz="4"/>
+          <w:left w:val="single" w:color="auto" w:sz="4"/>
+          <w:bottom w:val="single" w:color="auto" w:sz="4"/>
+          <w:right w:val="single" w:color="auto" w:sz="4"/>
+          <w:insideH w:val="single" w:color="auto" w:sz="4"/>
+          <w:insideV w:val="single" w:color="auto" w:sz="4"/>
+        </w:tblBorders>
+      </w:tblPr>
+      <w:tblGrid>
+        <w:gridCol w:w="10206"/>
+      </w:tblGrid>
+      <w:tr>
+        <w:trPr>
+          <w:cantSplit/>
+        </w:trPr>
+        <w:tc>
+          <w:tcPr>
+            <w:tcW w:type="dxa" w:w="10206"/>
+            <w:tcBorders>
+              <w:top w:val="none" w:color="FFFFFF" w:sz="0"/>
+              <w:left w:val="none" w:color="FFFFFF" w:sz="0"/>
+              <w:bottom w:val="none" w:color="FFFFFF" w:sz="0"/>
+              <w:right w:val="none" w:color="FFFFFF" w:sz="0"/>
+            </w:tcBorders>
+            <w:shd w:fill="EAF0FA" w:color="auto" w:val="clear"/>
+            <w:tcMar>
+              <w:top w:type="dxa" w:w="140"/>
+              <w:left w:type="dxa" w:w="180"/>
+              <w:bottom w:type="dxa" w:w="140"/>
+              <w:right w:type="dxa" w:w="100"/>
+            </w:tcMar>
+            <w:vAlign w:val="center"/>
+          </w:tcPr>
+          <w:p>
+            <w:pPr>
+              <w:spacing w:after="0" w:before="0"/>
+            </w:pPr>
+            <w:r>
+              <w:rPr>
+                <w:rFonts w:ascii="Calibri" w:cs="Calibri" w:eastAsia="Calibri" w:hAnsi="Calibri"/>
+                <w:color w:val="000000"/>
+                <w:sz w:val="21"/>
+                <w:szCs w:val="21"/>
+              </w:rPr>
+              <w:t xml:space="preserve">Grundlage: Rückmeldung zum Unterrichtsbesuch (12.10.: chaotische Sortierphase, weil nur ein Schüler aktiv war), Rückmeldungen 14.10. („Lernziele und Verlauf nach AVIVA vorzustellen hilft sehr“; Wiederholung extrem wichtig) und 15.10. (nur die erste Aufgabe geschafft).</w:t>
+            </w:r>
+          </w:p>
+        </w:tc>
+      </w:tr>
+    </w:tbl>
+    <w:p>
+      <w:pPr>
+        <w:keepNext/>
+        <w:spacing w:after="50" w:before="140"/>
+      </w:pPr>
+      <w:r>
+        <w:rPr>
+          <w:rFonts w:ascii="Cambria" w:cs="Cambria" w:eastAsia="Cambria" w:hAnsi="Cambria"/>
+          <w:b/>
+          <w:bCs/>
+          <w:color w:val="D9534F"/>
+          <w:sz w:val="22"/>
+          <w:szCs w:val="22"/>
+        </w:rPr>
+        <w:t xml:space="preserve">1  AVIVA – Struktur und Transparenz</w:t>
+      </w:r>
+    </w:p>
+    <w:p>
+      <w:pPr>
+        <w:spacing w:after="40" w:before="0"/>
+        <w:ind w:left="240" w:hanging="240"/>
+      </w:pPr>
+      <w:r>
+        <w:rPr>
+          <w:rFonts w:ascii="Calibri" w:cs="Calibri" w:eastAsia="Calibri" w:hAnsi="Calibri"/>
+          <w:b/>
+          <w:bCs/>
+          <w:color w:val="D9534F"/>
+          <w:sz w:val="21"/>
+          <w:szCs w:val="21"/>
+        </w:rPr>
+        <w:t xml:space="preserve">• </w:t>
+      </w:r>
+      <w:r>
+        <w:rPr>
+          <w:rFonts w:ascii="Calibri" w:cs="Calibri" w:eastAsia="Calibri" w:hAnsi="Calibri"/>
+          <w:b/>
+          <w:bCs/>
+          <w:color w:val="000000"/>
+          <w:sz w:val="21"/>
+          <w:szCs w:val="21"/>
+        </w:rPr>
+        <w:t xml:space="preserve">Ankommen: </w:t>
+      </w:r>
+      <w:r>
+        <w:rPr>
+          <w:rFonts w:ascii="Calibri" w:cs="Calibri" w:eastAsia="Calibri" w:hAnsi="Calibri"/>
+          <w:color w:val="000000"/>
+          <w:sz w:val="21"/>
+          <w:szCs w:val="21"/>
+        </w:rPr>
+        <w:t xml:space="preserve">Ziel als „Ich kann …“ und Ablauf mit * stehen vor der Stunde an der Seitentafel und werden zu Beginn vorgestellt. In der Auswertung wird ausdrücklich darauf zurückgegriffen („Ziel erreicht?“).</w:t>
+      </w:r>
+    </w:p>
+    <w:p>
+      <w:pPr>
+        <w:spacing w:after="40" w:before="0"/>
+        <w:ind w:left="240" w:hanging="240"/>
+      </w:pPr>
+      <w:r>
+        <w:rPr>
+          <w:rFonts w:ascii="Calibri" w:cs="Calibri" w:eastAsia="Calibri" w:hAnsi="Calibri"/>
+          <w:b/>
+          <w:bCs/>
+          <w:color w:val="D9534F"/>
+          <w:sz w:val="21"/>
+          <w:szCs w:val="21"/>
+        </w:rPr>
+        <w:t xml:space="preserve">• </w:t>
+      </w:r>
+      <w:r>
+        <w:rPr>
+          <w:rFonts w:ascii="Calibri" w:cs="Calibri" w:eastAsia="Calibri" w:hAnsi="Calibri"/>
+          <w:b/>
+          <w:bCs/>
+          <w:color w:val="000000"/>
+          <w:sz w:val="21"/>
+          <w:szCs w:val="21"/>
+        </w:rPr>
+        <w:t xml:space="preserve">Vorwissen aktivieren: </w:t>
+      </w:r>
+      <w:r>
+        <w:rPr>
+          <w:rFonts w:ascii="Calibri" w:cs="Calibri" w:eastAsia="Calibri" w:hAnsi="Calibri"/>
+          <w:color w:val="000000"/>
+          <w:sz w:val="21"/>
+          <w:szCs w:val="21"/>
+        </w:rPr>
+        <w:t xml:space="preserve">Echte Wiederholung statt Anriss: Die am Donnerstag offen gebliebene LB-Aufgabe 1 a wird nachgeholt, bevor Neues kommt. Sie sichert zugleich den Inhalt, den die Analyse braucht.</w:t>
+      </w:r>
+    </w:p>
+    <w:p>
+      <w:pPr>
+        <w:spacing w:after="40" w:before="0"/>
+        <w:ind w:left="240" w:hanging="240"/>
+      </w:pPr>
+      <w:r>
+        <w:rPr>
+          <w:rFonts w:ascii="Calibri" w:cs="Calibri" w:eastAsia="Calibri" w:hAnsi="Calibri"/>
+          <w:b/>
+          <w:bCs/>
+          <w:color w:val="D9534F"/>
+          <w:sz w:val="21"/>
+          <w:szCs w:val="21"/>
+        </w:rPr>
+        <w:t xml:space="preserve">• </w:t>
+      </w:r>
+      <w:r>
+        <w:rPr>
+          <w:rFonts w:ascii="Calibri" w:cs="Calibri" w:eastAsia="Calibri" w:hAnsi="Calibri"/>
+          <w:b/>
+          <w:bCs/>
+          <w:color w:val="000000"/>
+          <w:sz w:val="21"/>
+          <w:szCs w:val="21"/>
+        </w:rPr>
+        <w:t xml:space="preserve">Informieren: </w:t>
+      </w:r>
+      <w:r>
+        <w:rPr>
+          <w:rFonts w:ascii="Calibri" w:cs="Calibri" w:eastAsia="Calibri" w:hAnsi="Calibri"/>
+          <w:color w:val="000000"/>
+          <w:sz w:val="21"/>
+          <w:szCs w:val="21"/>
+        </w:rPr>
+        <w:t xml:space="preserve">Zwei kurze Inputs, jeweils direkt vor der passenden Übung. Kleinschrittig: zuerst Reime als Grundlage (sie waren neu), erst dann das Ur-Ei.</w:t>
+      </w:r>
+    </w:p>
+    <w:p>
+      <w:pPr>
+        <w:spacing w:after="40" w:before="0"/>
+        <w:ind w:left="240" w:hanging="240"/>
+      </w:pPr>
+      <w:r>
+        <w:rPr>
+          <w:rFonts w:ascii="Calibri" w:cs="Calibri" w:eastAsia="Calibri" w:hAnsi="Calibri"/>
+          <w:b/>
+          <w:bCs/>
+          <w:color w:val="D9534F"/>
+          <w:sz w:val="21"/>
+          <w:szCs w:val="21"/>
+        </w:rPr>
+        <w:t xml:space="preserve">• </w:t>
+      </w:r>
+      <w:r>
+        <w:rPr>
+          <w:rFonts w:ascii="Calibri" w:cs="Calibri" w:eastAsia="Calibri" w:hAnsi="Calibri"/>
+          <w:b/>
+          <w:bCs/>
+          <w:color w:val="000000"/>
+          <w:sz w:val="21"/>
+          <w:szCs w:val="21"/>
+        </w:rPr>
+        <w:t xml:space="preserve">Verarbeiten: </w:t>
+      </w:r>
+      <w:r>
+        <w:rPr>
+          <w:rFonts w:ascii="Calibri" w:cs="Calibri" w:eastAsia="Calibri" w:hAnsi="Calibri"/>
+          <w:color w:val="000000"/>
+          <w:sz w:val="21"/>
+          <w:szCs w:val="21"/>
+        </w:rPr>
+        <w:t xml:space="preserve">Jeder arbeitet allein am Schnipsel, danach Partnervergleich. Es gibt keine Phase, in der nur ein Schüler beschäftigt ist.</w:t>
+      </w:r>
+    </w:p>
+    <w:p>
+      <w:pPr>
+        <w:spacing w:after="40" w:before="0"/>
+        <w:ind w:left="240" w:hanging="240"/>
+      </w:pPr>
+      <w:r>
+        <w:rPr>
+          <w:rFonts w:ascii="Calibri" w:cs="Calibri" w:eastAsia="Calibri" w:hAnsi="Calibri"/>
+          <w:b/>
+          <w:bCs/>
+          <w:color w:val="D9534F"/>
+          <w:sz w:val="21"/>
+          <w:szCs w:val="21"/>
+        </w:rPr>
+        <w:t xml:space="preserve">• </w:t>
+      </w:r>
+      <w:r>
+        <w:rPr>
+          <w:rFonts w:ascii="Calibri" w:cs="Calibri" w:eastAsia="Calibri" w:hAnsi="Calibri"/>
+          <w:b/>
+          <w:bCs/>
+          <w:color w:val="000000"/>
+          <w:sz w:val="21"/>
+          <w:szCs w:val="21"/>
+        </w:rPr>
+        <w:t xml:space="preserve">Auswerten: </w:t>
+      </w:r>
+      <w:r>
+        <w:rPr>
+          <w:rFonts w:ascii="Calibri" w:cs="Calibri" w:eastAsia="Calibri" w:hAnsi="Calibri"/>
+          <w:color w:val="000000"/>
+          <w:sz w:val="21"/>
+          <w:szCs w:val="21"/>
+        </w:rPr>
+        <w:t xml:space="preserve">Kreide-Kette mit Auftrag für alle (mitprüfen, mit Grün verbessern), dann „Heute habe ich gelernt, …“. So wird der Lernzuwachs ausdrücklich.</w:t>
+      </w:r>
+    </w:p>
+    <w:p>
+      <w:pPr>
+        <w:spacing w:after="40" w:before="0"/>
+        <w:ind w:left="240" w:hanging="240"/>
+      </w:pPr>
+      <w:r>
+        <w:rPr>
+          <w:rFonts w:ascii="Calibri" w:cs="Calibri" w:eastAsia="Calibri" w:hAnsi="Calibri"/>
+          <w:b/>
+          <w:bCs/>
+          <w:color w:val="D9534F"/>
+          <w:sz w:val="21"/>
+          <w:szCs w:val="21"/>
+        </w:rPr>
+        <w:t xml:space="preserve">• </w:t>
+      </w:r>
+      <w:r>
+        <w:rPr>
+          <w:rFonts w:ascii="Calibri" w:cs="Calibri" w:eastAsia="Calibri" w:hAnsi="Calibri"/>
+          <w:b/>
+          <w:bCs/>
+          <w:color w:val="000000"/>
+          <w:sz w:val="21"/>
+          <w:szCs w:val="21"/>
+        </w:rPr>
+        <w:t xml:space="preserve">Zeit: </w:t>
+      </w:r>
+      <w:r>
+        <w:rPr>
+          <w:rFonts w:ascii="Calibri" w:cs="Calibri" w:eastAsia="Calibri" w:hAnsi="Calibri"/>
+          <w:color w:val="000000"/>
+          <w:sz w:val="21"/>
+          <w:szCs w:val="21"/>
+        </w:rPr>
+        <w:t xml:space="preserve">Kein Puffer, deshalb sind Epik und Dramatik bewusst mit * markiert. Kürzungsoption in der Wiederholung ist benannt. Lieber weniger Inhalt als eine unfertige Sicherung.</w:t>
+      </w:r>
+    </w:p>
+    <w:p>
+      <w:pPr>
+        <w:keepNext/>
+        <w:spacing w:after="50" w:before="140"/>
+      </w:pPr>
+      <w:r>
+        <w:rPr>
+          <w:rFonts w:ascii="Cambria" w:cs="Cambria" w:eastAsia="Cambria" w:hAnsi="Cambria"/>
+          <w:b/>
+          <w:bCs/>
+          <w:color w:val="1E2761"/>
+          <w:sz w:val="22"/>
+          <w:szCs w:val="22"/>
+        </w:rPr>
+        <w:t xml:space="preserve">2  Direkte Instruktion (DI) – Ich · Wir · Ihr</w:t>
+      </w:r>
+    </w:p>
+    <w:p>
+      <w:pPr>
+        <w:spacing w:after="40" w:before="0"/>
+        <w:ind w:left="240" w:hanging="240"/>
+      </w:pPr>
+      <w:r>
+        <w:rPr>
+          <w:rFonts w:ascii="Calibri" w:cs="Calibri" w:eastAsia="Calibri" w:hAnsi="Calibri"/>
+          <w:b/>
+          <w:bCs/>
+          <w:color w:val="D9534F"/>
+          <w:sz w:val="21"/>
+          <w:szCs w:val="21"/>
+        </w:rPr>
+        <w:t xml:space="preserve">• </w:t>
+      </w:r>
+      <w:r>
+        <w:rPr>
+          <w:rFonts w:ascii="Calibri" w:cs="Calibri" w:eastAsia="Calibri" w:hAnsi="Calibri"/>
+          <w:b/>
+          <w:bCs/>
+          <w:color w:val="000000"/>
+          <w:sz w:val="21"/>
+          <w:szCs w:val="21"/>
+        </w:rPr>
+        <w:t xml:space="preserve">Ziel und Relevanz: </w:t>
+      </w:r>
+      <w:r>
+        <w:rPr>
+          <w:rFonts w:ascii="Calibri" w:cs="Calibri" w:eastAsia="Calibri" w:hAnsi="Calibri"/>
+          <w:color w:val="000000"/>
+          <w:sz w:val="21"/>
+          <w:szCs w:val="21"/>
+        </w:rPr>
+        <w:t xml:space="preserve">Ein überprüfbares Ziel; das „Wofür?“ verweist auf die erste Bewertung (Analyse).</w:t>
+      </w:r>
+    </w:p>
+    <w:p>
+      <w:pPr>
+        <w:spacing w:after="40" w:before="0"/>
+        <w:ind w:left="240" w:hanging="240"/>
+      </w:pPr>
+      <w:r>
+        <w:rPr>
+          <w:rFonts w:ascii="Calibri" w:cs="Calibri" w:eastAsia="Calibri" w:hAnsi="Calibri"/>
+          <w:b/>
+          <w:bCs/>
+          <w:color w:val="D9534F"/>
+          <w:sz w:val="21"/>
+          <w:szCs w:val="21"/>
+        </w:rPr>
+        <w:t xml:space="preserve">• </w:t>
+      </w:r>
+      <w:r>
+        <w:rPr>
+          <w:rFonts w:ascii="Calibri" w:cs="Calibri" w:eastAsia="Calibri" w:hAnsi="Calibri"/>
+          <w:b/>
+          <w:bCs/>
+          <w:color w:val="000000"/>
+          <w:sz w:val="21"/>
+          <w:szCs w:val="21"/>
+        </w:rPr>
+        <w:t xml:space="preserve">Ich (Modellieren): </w:t>
+      </w:r>
+      <w:r>
+        <w:rPr>
+          <w:rFonts w:ascii="Calibri" w:cs="Calibri" w:eastAsia="Calibri" w:hAnsi="Calibri"/>
+          <w:color w:val="000000"/>
+          <w:sz w:val="21"/>
+          <w:szCs w:val="21"/>
+        </w:rPr>
+        <w:t xml:space="preserve">Die Lehrkraft zeigt an Strophe 1, wie man Versenden vergleicht und Buchstaben vergibt, und denkt laut („Ab wo klingen Bart und Riesenart gleich?“).</w:t>
+      </w:r>
+    </w:p>
+    <w:p>
+      <w:pPr>
+        <w:spacing w:after="40" w:before="0"/>
+        <w:ind w:left="240" w:hanging="240"/>
+      </w:pPr>
+      <w:r>
+        <w:rPr>
+          <w:rFonts w:ascii="Calibri" w:cs="Calibri" w:eastAsia="Calibri" w:hAnsi="Calibri"/>
+          <w:b/>
+          <w:bCs/>
+          <w:color w:val="D9534F"/>
+          <w:sz w:val="21"/>
+          <w:szCs w:val="21"/>
+        </w:rPr>
+        <w:t xml:space="preserve">• </w:t>
+      </w:r>
+      <w:r>
+        <w:rPr>
+          <w:rFonts w:ascii="Calibri" w:cs="Calibri" w:eastAsia="Calibri" w:hAnsi="Calibri"/>
+          <w:b/>
+          <w:bCs/>
+          <w:color w:val="000000"/>
+          <w:sz w:val="21"/>
+          <w:szCs w:val="21"/>
+        </w:rPr>
+        <w:t xml:space="preserve">Wir (angeleitetes Üben): </w:t>
+      </w:r>
+      <w:r>
+        <w:rPr>
+          <w:rFonts w:ascii="Calibri" w:cs="Calibri" w:eastAsia="Calibri" w:hAnsi="Calibri"/>
+          <w:color w:val="000000"/>
+          <w:sz w:val="21"/>
+          <w:szCs w:val="21"/>
+        </w:rPr>
+        <w:t xml:space="preserve">Die Klasse bestimmt Vers 3–5 mit. Verständnis wird mit Kontrollfragen geprüft (abab? abba?), Nr. 1 auf dem Ur-Ei-Schnipsel wird gemeinsam eingetragen.</w:t>
+      </w:r>
+    </w:p>
+    <w:p>
+      <w:pPr>
+        <w:spacing w:after="40" w:before="0"/>
+        <w:ind w:left="240" w:hanging="240"/>
+      </w:pPr>
+      <w:r>
+        <w:rPr>
+          <w:rFonts w:ascii="Calibri" w:cs="Calibri" w:eastAsia="Calibri" w:hAnsi="Calibri"/>
+          <w:b/>
+          <w:bCs/>
+          <w:color w:val="D9534F"/>
+          <w:sz w:val="21"/>
+          <w:szCs w:val="21"/>
+        </w:rPr>
+        <w:t xml:space="preserve">• </w:t>
+      </w:r>
+      <w:r>
+        <w:rPr>
+          <w:rFonts w:ascii="Calibri" w:cs="Calibri" w:eastAsia="Calibri" w:hAnsi="Calibri"/>
+          <w:b/>
+          <w:bCs/>
+          <w:color w:val="000000"/>
+          <w:sz w:val="21"/>
+          <w:szCs w:val="21"/>
+        </w:rPr>
+        <w:t xml:space="preserve">Ihr (selbstständiges Üben): </w:t>
+      </w:r>
+      <w:r>
+        <w:rPr>
+          <w:rFonts w:ascii="Calibri" w:cs="Calibri" w:eastAsia="Calibri" w:hAnsi="Calibri"/>
+          <w:color w:val="000000"/>
+          <w:sz w:val="21"/>
+          <w:szCs w:val="21"/>
+        </w:rPr>
+        <w:t xml:space="preserve">Reim-Schnipsel und Ur-Ei-Schnipsel allein, mit klarer Zeit und „Fertig? Stift hinlegen“.</w:t>
+      </w:r>
+    </w:p>
+    <w:p>
+      <w:pPr>
+        <w:spacing w:after="40" w:before="0"/>
+        <w:ind w:left="240" w:hanging="240"/>
+      </w:pPr>
+      <w:r>
+        <w:rPr>
+          <w:rFonts w:ascii="Calibri" w:cs="Calibri" w:eastAsia="Calibri" w:hAnsi="Calibri"/>
+          <w:b/>
+          <w:bCs/>
+          <w:color w:val="D9534F"/>
+          <w:sz w:val="21"/>
+          <w:szCs w:val="21"/>
+        </w:rPr>
+        <w:t xml:space="preserve">• </w:t>
+      </w:r>
+      <w:r>
+        <w:rPr>
+          <w:rFonts w:ascii="Calibri" w:cs="Calibri" w:eastAsia="Calibri" w:hAnsi="Calibri"/>
+          <w:b/>
+          <w:bCs/>
+          <w:color w:val="000000"/>
+          <w:sz w:val="21"/>
+          <w:szCs w:val="21"/>
+        </w:rPr>
+        <w:t xml:space="preserve">Rückmeldung: </w:t>
+      </w:r>
+      <w:r>
+        <w:rPr>
+          <w:rFonts w:ascii="Calibri" w:cs="Calibri" w:eastAsia="Calibri" w:hAnsi="Calibri"/>
+          <w:color w:val="000000"/>
+          <w:sz w:val="21"/>
+          <w:szCs w:val="21"/>
+        </w:rPr>
+        <w:t xml:space="preserve">Partnervergleich mit Grün und Kreide-Kette. Beim Herumgehen auf die vorab benannten Hürden achten: umarmender Reim (Nr. 3), Höhepunkt (Ur-Ei Nr. 5).</w:t>
+      </w:r>
+    </w:p>
+    <w:p>
+      <w:pPr>
+        <w:spacing w:after="40" w:before="0"/>
+        <w:ind w:left="240" w:hanging="240"/>
+      </w:pPr>
+      <w:r>
+        <w:rPr>
+          <w:rFonts w:ascii="Calibri" w:cs="Calibri" w:eastAsia="Calibri" w:hAnsi="Calibri"/>
+          <w:b/>
+          <w:bCs/>
+          <w:color w:val="D9534F"/>
+          <w:sz w:val="21"/>
+          <w:szCs w:val="21"/>
+        </w:rPr>
+        <w:t xml:space="preserve">• </w:t>
+      </w:r>
+      <w:r>
+        <w:rPr>
+          <w:rFonts w:ascii="Calibri" w:cs="Calibri" w:eastAsia="Calibri" w:hAnsi="Calibri"/>
+          <w:b/>
+          <w:bCs/>
+          <w:color w:val="000000"/>
+          <w:sz w:val="21"/>
+          <w:szCs w:val="21"/>
+        </w:rPr>
+        <w:t xml:space="preserve">Klarheit: </w:t>
+      </w:r>
+      <w:r>
+        <w:rPr>
+          <w:rFonts w:ascii="Calibri" w:cs="Calibri" w:eastAsia="Calibri" w:hAnsi="Calibri"/>
+          <w:color w:val="000000"/>
+          <w:sz w:val="21"/>
+          <w:szCs w:val="21"/>
+        </w:rPr>
+        <w:t xml:space="preserve">Feste, wörtliche Ansagen bei jedem Wechsel; Aufgaben immer im gleichen Format.</w:t>
+      </w:r>
+    </w:p>
+    <w:p>
+      <w:pPr>
+        <w:keepNext/>
+        <w:spacing w:after="50" w:before="140"/>
+      </w:pPr>
+      <w:r>
+        <w:rPr>
+          <w:rFonts w:ascii="Cambria" w:cs="Cambria" w:eastAsia="Cambria" w:hAnsi="Cambria"/>
+          <w:b/>
+          <w:bCs/>
+          <w:color w:val="2A8C8C"/>
+          <w:sz w:val="22"/>
+          <w:szCs w:val="22"/>
+        </w:rPr>
+        <w:t xml:space="preserve">3  Differenzierung</w:t>
+      </w:r>
+    </w:p>
+    <w:p>
+      <w:pPr>
+        <w:spacing w:after="40" w:before="0"/>
+        <w:ind w:left="240" w:hanging="240"/>
+      </w:pPr>
+      <w:r>
+        <w:rPr>
+          <w:rFonts w:ascii="Calibri" w:cs="Calibri" w:eastAsia="Calibri" w:hAnsi="Calibri"/>
+          <w:b/>
+          <w:bCs/>
+          <w:color w:val="D9534F"/>
+          <w:sz w:val="21"/>
+          <w:szCs w:val="21"/>
+        </w:rPr>
+        <w:t xml:space="preserve">• </w:t>
+      </w:r>
+      <w:r>
+        <w:rPr>
+          <w:rFonts w:ascii="Calibri" w:cs="Calibri" w:eastAsia="Calibri" w:hAnsi="Calibri"/>
+          <w:color w:val="000000"/>
+          <w:sz w:val="21"/>
+          <w:szCs w:val="21"/>
+        </w:rPr>
+        <w:t xml:space="preserve">Tandems lesestärker/leseschwächer beim Tandemlesen.</w:t>
+      </w:r>
+    </w:p>
+    <w:p>
+      <w:pPr>
+        <w:spacing w:after="40" w:before="0"/>
+        <w:ind w:left="240" w:hanging="240"/>
+      </w:pPr>
+      <w:r>
+        <w:rPr>
+          <w:rFonts w:ascii="Calibri" w:cs="Calibri" w:eastAsia="Calibri" w:hAnsi="Calibri"/>
+          <w:b/>
+          <w:bCs/>
+          <w:color w:val="D9534F"/>
+          <w:sz w:val="21"/>
+          <w:szCs w:val="21"/>
+        </w:rPr>
+        <w:t xml:space="preserve">• </w:t>
+      </w:r>
+      <w:r>
+        <w:rPr>
+          <w:rFonts w:ascii="Calibri" w:cs="Calibri" w:eastAsia="Calibri" w:hAnsi="Calibri"/>
+          <w:color w:val="000000"/>
+          <w:sz w:val="21"/>
+          <w:szCs w:val="21"/>
+        </w:rPr>
+        <w:t xml:space="preserve">Aufgaben mit * für Schnelle (Ur-Ei Nr. 4–8, Kehrreim in Reim-Übung 1).</w:t>
+      </w:r>
+    </w:p>
+    <w:p>
+      <w:pPr>
+        <w:spacing w:after="40" w:before="0"/>
+        <w:ind w:left="240" w:hanging="240"/>
+      </w:pPr>
+      <w:r>
+        <w:rPr>
+          <w:rFonts w:ascii="Calibri" w:cs="Calibri" w:eastAsia="Calibri" w:hAnsi="Calibri"/>
+          <w:b/>
+          <w:bCs/>
+          <w:color w:val="D9534F"/>
+          <w:sz w:val="21"/>
+          <w:szCs w:val="21"/>
+        </w:rPr>
+        <w:t xml:space="preserve">• </w:t>
+      </w:r>
+      <w:r>
+        <w:rPr>
+          <w:rFonts w:ascii="Calibri" w:cs="Calibri" w:eastAsia="Calibri" w:hAnsi="Calibri"/>
+          <w:color w:val="000000"/>
+          <w:sz w:val="21"/>
+          <w:szCs w:val="21"/>
+        </w:rPr>
+        <w:t xml:space="preserve">Merkkasten auf dem Schnipsel statt Abschreiben; Übungstexte mit Sportbezug (Heben, Judo) nur in der Reimübung, die Ballade bleibt im Vordergrund.</w:t>
+      </w:r>
+    </w:p>
+    <w:p>
+      <w:pPr>
+        <w:spacing w:after="40" w:before="0"/>
+        <w:ind w:left="240" w:hanging="240"/>
+      </w:pPr>
+      <w:r>
+        <w:rPr>
+          <w:rFonts w:ascii="Calibri" w:cs="Calibri" w:eastAsia="Calibri" w:hAnsi="Calibri"/>
+          <w:b/>
+          <w:bCs/>
+          <w:color w:val="D9534F"/>
+          <w:sz w:val="21"/>
+          <w:szCs w:val="21"/>
+        </w:rPr>
+        <w:t xml:space="preserve">• </w:t>
+      </w:r>
+      <w:r>
+        <w:rPr>
+          <w:rFonts w:ascii="Calibri" w:cs="Calibri" w:eastAsia="Calibri" w:hAnsi="Calibri"/>
+          <w:color w:val="000000"/>
+          <w:sz w:val="21"/>
+          <w:szCs w:val="21"/>
+        </w:rPr>
+        <w:t xml:space="preserve">S-PL: Handreichung mit beiden Schnipseln zweisprachig (Aufgaben deutsch, Erklärungen polnisch), Vokabelliste und Lernwortschatz.</w:t>
+      </w:r>
+    </w:p>
+    <w:p>
+      <w:pPr>
+        <w:keepNext/>
+        <w:spacing w:after="50" w:before="140"/>
+      </w:pPr>
+      <w:r>
+        <w:rPr>
+          <w:rFonts w:ascii="Cambria" w:cs="Cambria" w:eastAsia="Cambria" w:hAnsi="Cambria"/>
+          <w:b/>
+          <w:bCs/>
+          <w:color w:val="5B6B8C"/>
+          <w:sz w:val="22"/>
+          <w:szCs w:val="22"/>
+        </w:rPr>
+        <w:t xml:space="preserve">4  Beobachtungsschwerpunkte für die Rückmeldung nach der Stunde</w:t>
+      </w:r>
+    </w:p>
+    <w:p>
+      <w:pPr>
+        <w:spacing w:after="40" w:before="0"/>
+        <w:ind w:left="240" w:hanging="240"/>
+      </w:pPr>
+      <w:r>
+        <w:rPr>
+          <w:rFonts w:ascii="Calibri" w:cs="Calibri" w:eastAsia="Calibri" w:hAnsi="Calibri"/>
+          <w:b/>
+          <w:bCs/>
+          <w:color w:val="D9534F"/>
+          <w:sz w:val="21"/>
+          <w:szCs w:val="21"/>
+        </w:rPr>
+        <w:t xml:space="preserve">• </w:t>
+      </w:r>
+      <w:r>
+        <w:rPr>
+          <w:rFonts w:ascii="Calibri" w:cs="Calibri" w:eastAsia="Calibri" w:hAnsi="Calibri"/>
+          <w:color w:val="000000"/>
+          <w:sz w:val="21"/>
+          <w:szCs w:val="21"/>
+        </w:rPr>
+        <w:t xml:space="preserve">Hat der Reim-Input für alle gereicht, oder brauchte die Klasse mehr gemeinsames Üben (Wir-Phase)?</w:t>
+      </w:r>
+    </w:p>
+    <w:p>
+      <w:pPr>
+        <w:spacing w:after="40" w:before="0"/>
+        <w:ind w:left="240" w:hanging="240"/>
+      </w:pPr>
+      <w:r>
+        <w:rPr>
+          <w:rFonts w:ascii="Calibri" w:cs="Calibri" w:eastAsia="Calibri" w:hAnsi="Calibri"/>
+          <w:b/>
+          <w:bCs/>
+          <w:color w:val="D9534F"/>
+          <w:sz w:val="21"/>
+          <w:szCs w:val="21"/>
+        </w:rPr>
+        <w:t xml:space="preserve">• </w:t>
+      </w:r>
+      <w:r>
+        <w:rPr>
+          <w:rFonts w:ascii="Calibri" w:cs="Calibri" w:eastAsia="Calibri" w:hAnsi="Calibri"/>
+          <w:color w:val="000000"/>
+          <w:sz w:val="21"/>
+          <w:szCs w:val="21"/>
+        </w:rPr>
+        <w:t xml:space="preserve">Wie weit kam die Klasse auf dem Ur-Ei-Schnipsel? Was wird nach den Ferien als Wiederholung aufgegriffen?</w:t>
+      </w:r>
+    </w:p>
+    <w:p>
+      <w:pPr>
+        <w:spacing w:after="40" w:before="0"/>
+        <w:ind w:left="240" w:hanging="240"/>
+      </w:pPr>
+      <w:r>
+        <w:rPr>
+          <w:rFonts w:ascii="Calibri" w:cs="Calibri" w:eastAsia="Calibri" w:hAnsi="Calibri"/>
+          <w:b/>
+          <w:bCs/>
+          <w:color w:val="D9534F"/>
+          <w:sz w:val="21"/>
+          <w:szCs w:val="21"/>
+        </w:rPr>
+        <w:t xml:space="preserve">• </w:t>
+      </w:r>
+      <w:r>
+        <w:rPr>
+          <w:rFonts w:ascii="Calibri" w:cs="Calibri" w:eastAsia="Calibri" w:hAnsi="Calibri"/>
+          <w:color w:val="000000"/>
+          <w:sz w:val="21"/>
+          <w:szCs w:val="21"/>
+        </w:rPr>
+        <w:t xml:space="preserve">Waren in jeder Phase alle aktiv – auch während der Kreide-Kette?</w:t>
+      </w:r>
+    </w:p>
+    <w:p>
+      <w:pPr>
+        <w:spacing w:after="40" w:before="0"/>
+        <w:ind w:left="240" w:hanging="240"/>
+      </w:pPr>
+      <w:r>
+        <w:rPr>
+          <w:rFonts w:ascii="Calibri" w:cs="Calibri" w:eastAsia="Calibri" w:hAnsi="Calibri"/>
+          <w:b/>
+          <w:bCs/>
+          <w:color w:val="D9534F"/>
+          <w:sz w:val="21"/>
+          <w:szCs w:val="21"/>
+        </w:rPr>
+        <w:t xml:space="preserve">• </w:t>
+      </w:r>
+      <w:r>
+        <w:rPr>
+          <w:rFonts w:ascii="Calibri" w:cs="Calibri" w:eastAsia="Calibri" w:hAnsi="Calibri"/>
+          <w:color w:val="000000"/>
+          <w:sz w:val="21"/>
+          <w:szCs w:val="21"/>
+        </w:rPr>
+        <w:t xml:space="preserve">Kam S-PL mit der Handreichung selbstständig zurecht?</w:t>
+      </w:r>
+    </w:p>
     <w:sectPr>
-      <w:headerReference w:type="default" r:id="rId7"/>
-      <w:footerReference w:type="default" r:id="rId8"/>
+      <w:headerReference w:type="default" r:id="rId6"/>
+      <w:footerReference w:type="default" r:id="rId7"/>
       <w:pgSz w:w="11906" w:h="16838" w:orient="portrait"/>
       <w:pgMar w:top="900" w:right="850" w:bottom="800" w:left="850" w:header="400" w:footer="400" w:gutter="0"/>
       <w:pgNumType/>
@@ -4566,10 +5381,6 @@
     </w:sectPr>
   </w:body>
 </w:document>
-</file>
-
-<file path=word/comments.xml><?xml version="1.0" encoding="utf-8"?>
-<w:comments xmlns:cx="http://schemas.microsoft.com/office/drawing/2014/chartex" xmlns:cx1="http://schemas.microsoft.com/office/drawing/2015/9/8/chartex" xmlns:cx2="http://schemas.microsoft.com/office/drawing/2015/10/21/chartex" xmlns:cx3="http://schemas.microsoft.com/office/drawing/2016/5/9/chartex" xmlns:cx4="http://schemas.microsoft.com/office/drawing/2016/5/10/chartex" xmlns:cx5="http://schemas.microsoft.com/office/drawing/2016/5/11/chartex" xmlns:cx6="http://schemas.microsoft.com/office/drawing/2016/5/12/chartex" xmlns:cx7="http://schemas.microsoft.com/office/drawing/2016/5/13/chartex" xmlns:cx8="http://schemas.microsoft.com/office/drawing/2016/5/14/chartex" xmlns:mc="http://schemas.openxmlformats.org/markup-compatibility/2006" xmlns:aink="http://schemas.microsoft.com/office/drawing/2016/ink" xmlns:am3d="http://schemas.microsoft.com/office/drawing/2017/model3d" xmlns:o="urn:schemas-microsoft-com:office:office" xmlns:r="http://schemas.openxmlformats.org/officeDocument/2006/relationships" xmlns:m="http://schemas.openxmlformats.org/officeDocument/2006/math" xmlns:v="urn:schemas-microsoft-com:vml" xmlns:wp14="http://schemas.microsoft.com/office/word/2010/wordprocessingDrawing" xmlns:wp="http://schemas.openxmlformats.org/drawingml/2006/wordprocessingDrawing" xmlns:w10="urn:schemas-microsoft-com:office:word" xmlns:w="http://schemas.openxmlformats.org/wordprocessingml/2006/main" xmlns:w14="http://schemas.microsoft.com/office/word/2010/wordml" xmlns:w15="http://schemas.microsoft.com/office/word/2012/wordml" xmlns:w16cex="http://schemas.microsoft.com/office/word/2018/wordml/cex" xmlns:w16cid="http://schemas.microsoft.com/office/word/2016/wordml/cid" xmlns:w16="http://schemas.microsoft.com/office/word/2018/wordml" xmlns:w16sdtdh="http://schemas.microsoft.com/office/word/2020/wordml/sdtdatahash" xmlns:w16se="http://schemas.microsoft.com/office/word/2015/wordml/symex" xmlns:wpg="http://schemas.microsoft.com/office/word/2010/wordprocessingGroup" xmlns:wpi="http://schemas.microsoft.com/office/word/2010/wordprocessingInk" xmlns:wne="http://schemas.microsoft.com/office/word/2006/wordml" xmlns:wps="http://schemas.microsoft.com/office/word/2010/wordprocessingShape"/>
 </file>
 
 <file path=word/endnotes.xml><?xml version="1.0" encoding="utf-8"?>
@@ -4623,9 +5434,41 @@
         <w:szCs w:val="16"/>
       </w:rPr>
       <w:t xml:space="preserve">Tafelskript · Seite </w:t>
+    </w:r>
+    <w:r>
+      <w:rPr>
+        <w:rFonts w:ascii="Calibri" w:cs="Calibri" w:eastAsia="Calibri" w:hAnsi="Calibri"/>
+        <w:color w:val="5B6B8C"/>
+        <w:sz w:val="16"/>
+        <w:szCs w:val="16"/>
+      </w:rPr>
       <w:fldChar w:fldCharType="begin"/>
+    </w:r>
+    <w:r>
+      <w:rPr>
+        <w:rFonts w:ascii="Calibri" w:cs="Calibri" w:eastAsia="Calibri" w:hAnsi="Calibri"/>
+        <w:color w:val="5B6B8C"/>
+        <w:sz w:val="16"/>
+        <w:szCs w:val="16"/>
+      </w:rPr>
       <w:instrText xml:space="preserve">PAGE</w:instrText>
+    </w:r>
+    <w:r>
+      <w:rPr>
+        <w:rFonts w:ascii="Calibri" w:cs="Calibri" w:eastAsia="Calibri" w:hAnsi="Calibri"/>
+        <w:color w:val="5B6B8C"/>
+        <w:sz w:val="16"/>
+        <w:szCs w:val="16"/>
+      </w:rPr>
       <w:fldChar w:fldCharType="separate"/>
+    </w:r>
+    <w:r>
+      <w:rPr>
+        <w:rFonts w:ascii="Calibri" w:cs="Calibri" w:eastAsia="Calibri" w:hAnsi="Calibri"/>
+        <w:color w:val="5B6B8C"/>
+        <w:sz w:val="16"/>
+        <w:szCs w:val="16"/>
+      </w:rPr>
       <w:fldChar w:fldCharType="end"/>
     </w:r>
   </w:p>
@@ -4703,7 +5546,7 @@
 <w:numbering xmlns:wpc="http://schemas.microsoft.com/office/word/2010/wordprocessingCanvas" xmlns:mc="http://schemas.openxmlformats.org/markup-compatibility/2006" xmlns:o="urn:schemas-microsoft-com:office:office" xmlns:r="http://schemas.openxmlformats.org/officeDocument/2006/relationships" xmlns:m="http://schemas.openxmlformats.org/officeDocument/2006/math" xmlns:v="urn:schemas-microsoft-com:vml" xmlns:wp14="http://schemas.microsoft.com/office/word/2010/wordprocessingDrawing" xmlns:wp="http://schemas.openxmlformats.org/drawingml/2006/wordprocessingDrawing" xmlns:w10="urn:schemas-microsoft-com:office:word" xmlns:w="http://schemas.openxmlformats.org/wordprocessingml/2006/main" xmlns:w14="http://schemas.microsoft.com/office/word/2010/wordml" xmlns:w15="http://schemas.microsoft.com/office/word/2012/wordml" xmlns:wpg="http://schemas.microsoft.com/office/word/2010/wordprocessingGroup" xmlns:wpi="http://schemas.microsoft.com/office/word/2010/wordprocessingInk" xmlns:wne="http://schemas.microsoft.com/office/word/2006/wordml" xmlns:wps="http://schemas.microsoft.com/office/word/2010/wordprocessingShape" mc:Ignorable="w14 w15 wp14">
   <w:abstractNum w:abstractNumId="1" w15:restartNumberingAfterBreak="0">
     <w:multiLevelType w:val="hybridMultilevel"/>
-    <w:lvl w:ilvl="0" w15:tentative="1">
+    <w:lvl w:ilvl="0" w:tentative="1">
       <w:start w:val="1"/>
       <w:numFmt w:val="bullet"/>
       <w:lvlText w:val="●"/>
@@ -4712,7 +5555,7 @@
         <w:ind w:left="720" w:hanging="360"/>
       </w:pPr>
     </w:lvl>
-    <w:lvl w:ilvl="1" w15:tentative="1">
+    <w:lvl w:ilvl="1" w:tentative="1">
       <w:start w:val="1"/>
       <w:numFmt w:val="bullet"/>
       <w:lvlText w:val="○"/>
@@ -4721,7 +5564,7 @@
         <w:ind w:left="1440" w:hanging="360"/>
       </w:pPr>
     </w:lvl>
-    <w:lvl w:ilvl="2" w15:tentative="1">
+    <w:lvl w:ilvl="2" w:tentative="1">
       <w:start w:val="1"/>
       <w:numFmt w:val="bullet"/>
       <w:lvlText w:val="■"/>
@@ -4730,7 +5573,7 @@
         <w:ind w:left="2160" w:hanging="360"/>
       </w:pPr>
     </w:lvl>
-    <w:lvl w:ilvl="3" w15:tentative="1">
+    <w:lvl w:ilvl="3" w:tentative="1">
       <w:start w:val="1"/>
       <w:numFmt w:val="bullet"/>
       <w:lvlText w:val="●"/>
@@ -4739,7 +5582,7 @@
         <w:ind w:left="2880" w:hanging="360"/>
       </w:pPr>
     </w:lvl>
-    <w:lvl w:ilvl="4" w15:tentative="1">
+    <w:lvl w:ilvl="4" w:tentative="1">
       <w:start w:val="1"/>
       <w:numFmt w:val="bullet"/>
       <w:lvlText w:val="○"/>
@@ -4748,7 +5591,7 @@
         <w:ind w:left="3600" w:hanging="360"/>
       </w:pPr>
     </w:lvl>
-    <w:lvl w:ilvl="5" w15:tentative="1">
+    <w:lvl w:ilvl="5" w:tentative="1">
       <w:start w:val="1"/>
       <w:numFmt w:val="bullet"/>
       <w:lvlText w:val="■"/>
@@ -4757,7 +5600,7 @@
         <w:ind w:left="4320" w:hanging="360"/>
       </w:pPr>
     </w:lvl>
-    <w:lvl w:ilvl="6" w15:tentative="1">
+    <w:lvl w:ilvl="6" w:tentative="1">
       <w:start w:val="1"/>
       <w:numFmt w:val="bullet"/>
       <w:lvlText w:val="●"/>
@@ -4766,7 +5609,7 @@
         <w:ind w:left="5040" w:hanging="360"/>
       </w:pPr>
     </w:lvl>
-    <w:lvl w:ilvl="7" w15:tentative="1">
+    <w:lvl w:ilvl="7" w:tentative="1">
       <w:start w:val="1"/>
       <w:numFmt w:val="bullet"/>
       <w:lvlText w:val="●"/>
@@ -4775,7 +5618,7 @@
         <w:ind w:left="5760" w:hanging="360"/>
       </w:pPr>
     </w:lvl>
-    <w:lvl w:ilvl="8" w15:tentative="1">
+    <w:lvl w:ilvl="8" w:tentative="1">
       <w:start w:val="1"/>
       <w:numFmt w:val="bullet"/>
       <w:lvlText w:val="●"/>
@@ -4806,6 +5649,25 @@
     </w:rPrDefault>
     <w:pPrDefault/>
   </w:docDefaults>
+  <w:style w:type="paragraph" w:styleId="Normal" w:default="1">
+    <w:name w:val="Normal"/>
+    <w:qFormat/>
+  </w:style>
+  <w:style w:type="table" w:styleId="TableNormal" w:default="true">
+    <w:name w:val="Normal Table"/>
+    <w:uiPriority w:val="99"/>
+    <w:semiHidden/>
+    <w:unhideWhenUsed/>
+    <w:tblPr>
+      <w:tblInd w:type="dxa" w:w="0"/>
+      <w:tblCellMar>
+        <w:top w:type="dxa" w:w="0"/>
+        <w:left w:type="dxa" w:w="108"/>
+        <w:bottom w:type="dxa" w:w="0"/>
+        <w:right w:type="dxa" w:w="108"/>
+      </w:tblCellMar>
+    </w:tblPr>
+  </w:style>
   <w:style w:type="paragraph" w:styleId="Title">
     <w:name w:val="Title"/>
     <w:basedOn w:val="Normal"/>
@@ -4893,6 +5755,139 @@
     <w:basedOn w:val="Normal"/>
     <w:qFormat/>
   </w:style>
+  <w:style w:type="paragraph" w:styleId="Caption">
+    <w:name w:val="caption"/>
+    <w:basedOn w:val="Normal"/>
+    <w:next w:val="Normal"/>
+    <w:uiPriority w:val="35"/>
+    <w:semiHidden/>
+    <w:unhideWhenUsed/>
+    <w:qFormat/>
+    <w:pPr>
+      <w:spacing w:after="200"/>
+    </w:pPr>
+    <w:rPr>
+      <w:i/>
+      <w:iCs/>
+      <w:color w:val="44546A" w:themeColor="dark2"/>
+      <w:sz w:val="18"/>
+      <w:szCs w:val="18"/>
+    </w:rPr>
+  </w:style>
+  <w:style w:type="paragraph" w:styleId="Bibliography">
+    <w:name w:val="Bibliography"/>
+    <w:basedOn w:val="Normal"/>
+    <w:next w:val="Normal"/>
+    <w:uiPriority w:val="37"/>
+    <w:unhideWhenUsed/>
+  </w:style>
+  <w:style w:type="paragraph" w:styleId="TOC1">
+    <w:name w:val="toc 1"/>
+    <w:basedOn w:val="Normal"/>
+    <w:next w:val="Normal"/>
+    <w:uiPriority w:val="39"/>
+    <w:semiHidden/>
+    <w:unhideWhenUsed/>
+    <w:pPr>
+      <w:spacing w:after="100"/>
+    </w:pPr>
+  </w:style>
+  <w:style w:type="paragraph" w:styleId="TOC2">
+    <w:name w:val="toc 2"/>
+    <w:basedOn w:val="Normal"/>
+    <w:next w:val="Normal"/>
+    <w:uiPriority w:val="39"/>
+    <w:semiHidden/>
+    <w:unhideWhenUsed/>
+    <w:pPr>
+      <w:spacing w:after="100"/>
+      <w:ind w:left="220"/>
+    </w:pPr>
+  </w:style>
+  <w:style w:type="paragraph" w:styleId="TOC3">
+    <w:name w:val="toc 3"/>
+    <w:basedOn w:val="Normal"/>
+    <w:next w:val="Normal"/>
+    <w:uiPriority w:val="39"/>
+    <w:semiHidden/>
+    <w:unhideWhenUsed/>
+    <w:pPr>
+      <w:spacing w:after="100"/>
+      <w:ind w:left="440"/>
+    </w:pPr>
+  </w:style>
+  <w:style w:type="paragraph" w:styleId="TOC4">
+    <w:name w:val="toc 4"/>
+    <w:basedOn w:val="Normal"/>
+    <w:next w:val="Normal"/>
+    <w:uiPriority w:val="39"/>
+    <w:semiHidden/>
+    <w:unhideWhenUsed/>
+    <w:pPr>
+      <w:spacing w:after="100"/>
+      <w:ind w:left="660"/>
+    </w:pPr>
+  </w:style>
+  <w:style w:type="paragraph" w:styleId="TOC5">
+    <w:name w:val="toc 5"/>
+    <w:basedOn w:val="Normal"/>
+    <w:next w:val="Normal"/>
+    <w:uiPriority w:val="39"/>
+    <w:semiHidden/>
+    <w:unhideWhenUsed/>
+    <w:pPr>
+      <w:spacing w:after="100"/>
+      <w:ind w:left="880"/>
+    </w:pPr>
+  </w:style>
+  <w:style w:type="paragraph" w:styleId="TOC6">
+    <w:name w:val="toc 6"/>
+    <w:basedOn w:val="Normal"/>
+    <w:next w:val="Normal"/>
+    <w:uiPriority w:val="39"/>
+    <w:semiHidden/>
+    <w:unhideWhenUsed/>
+    <w:pPr>
+      <w:spacing w:after="100"/>
+      <w:ind w:left="1100"/>
+    </w:pPr>
+  </w:style>
+  <w:style w:type="paragraph" w:styleId="TOC7">
+    <w:name w:val="toc 7"/>
+    <w:basedOn w:val="Normal"/>
+    <w:next w:val="Normal"/>
+    <w:uiPriority w:val="39"/>
+    <w:semiHidden/>
+    <w:unhideWhenUsed/>
+    <w:pPr>
+      <w:spacing w:after="100"/>
+      <w:ind w:left="1320"/>
+    </w:pPr>
+  </w:style>
+  <w:style w:type="paragraph" w:styleId="TOC8">
+    <w:name w:val="toc 8"/>
+    <w:basedOn w:val="Normal"/>
+    <w:next w:val="Normal"/>
+    <w:uiPriority w:val="39"/>
+    <w:semiHidden/>
+    <w:unhideWhenUsed/>
+    <w:pPr>
+      <w:spacing w:after="100"/>
+      <w:ind w:left="1540"/>
+    </w:pPr>
+  </w:style>
+  <w:style w:type="paragraph" w:styleId="TOC9">
+    <w:name w:val="toc 9"/>
+    <w:basedOn w:val="Normal"/>
+    <w:next w:val="Normal"/>
+    <w:uiPriority w:val="39"/>
+    <w:semiHidden/>
+    <w:unhideWhenUsed/>
+    <w:pPr>
+      <w:spacing w:after="100"/>
+      <w:ind w:left="1760"/>
+    </w:pPr>
+  </w:style>
   <w:style w:type="character" w:styleId="Hyperlink">
     <w:name w:val="Hyperlink"/>
     <w:basedOn w:val="DefaultParagraphFont"/>
@@ -4977,5 +5972,302 @@
       <w:szCs w:val="20"/>
     </w:rPr>
   </w:style>
+  <w:style w:type="character" w:styleId="LineNumber">
+    <w:name w:val="line number"/>
+    <w:basedOn w:val="DefaultParagraphFont"/>
+    <w:uiPriority w:val="99"/>
+    <w:semiHidden/>
+    <w:unhideWhenUsed/>
+  </w:style>
 </w:styles>
+</file>
+
+<file path=word/theme/theme1.xml><?xml version="1.0" encoding="utf-8"?>
+<a:theme xmlns:a="http://schemas.openxmlformats.org/drawingml/2006/main" name="Office Theme">
+  <a:themeElements>
+    <a:clrScheme name="Office">
+      <a:dk1>
+        <a:sysClr val="windowText" lastClr="000000"/>
+      </a:dk1>
+      <a:lt1>
+        <a:sysClr val="window" lastClr="FFFFFF"/>
+      </a:lt1>
+      <a:dk2>
+        <a:srgbClr val="44546A"/>
+      </a:dk2>
+      <a:lt2>
+        <a:srgbClr val="E7E6E6"/>
+      </a:lt2>
+      <a:accent1>
+        <a:srgbClr val="4472C4"/>
+      </a:accent1>
+      <a:accent2>
+        <a:srgbClr val="ED7D31"/>
+      </a:accent2>
+      <a:accent3>
+        <a:srgbClr val="A5A5A5"/>
+      </a:accent3>
+      <a:accent4>
+        <a:srgbClr val="FFC000"/>
+      </a:accent4>
+      <a:accent5>
+        <a:srgbClr val="5B9BD5"/>
+      </a:accent5>
+      <a:accent6>
+        <a:srgbClr val="70AD47"/>
+      </a:accent6>
+      <a:hlink>
+        <a:srgbClr val="0563C1"/>
+      </a:hlink>
+      <a:folHlink>
+        <a:srgbClr val="954F72"/>
+      </a:folHlink>
+    </a:clrScheme>
+    <a:fontScheme name="Office">
+      <a:majorFont>
+        <a:latin typeface="Calibri Light" panose="020F0302020204030204"/>
+        <a:ea typeface=""/>
+        <a:cs typeface=""/>
+        <a:font script="Jpan" typeface="游ゴシック Light"/>
+        <a:font script="Hang" typeface="맑은 고딕"/>
+        <a:font script="Hans" typeface="等线 Light"/>
+        <a:font script="Hant" typeface="新細明體"/>
+        <a:font script="Arab" typeface="Times New Roman"/>
+        <a:font script="Hebr" typeface="Times New Roman"/>
+        <a:font script="Thai" typeface="Angsana New"/>
+        <a:font script="Ethi" typeface="Nyala"/>
+        <a:font script="Beng" typeface="Vrinda"/>
+        <a:font script="Gujr" typeface="Shruti"/>
+        <a:font script="Khmr" typeface="MoolBoran"/>
+        <a:font script="Knda" typeface="Tunga"/>
+        <a:font script="Guru" typeface="Raavi"/>
+        <a:font script="Cans" typeface="Euphemia"/>
+        <a:font script="Cher" typeface="Plantagenet Cherokee"/>
+        <a:font script="Yiii" typeface="Microsoft Yi Baiti"/>
+        <a:font script="Tibt" typeface="Microsoft Himalaya"/>
+        <a:font script="Thaa" typeface="MV Boli"/>
+        <a:font script="Deva" typeface="Mangal"/>
+        <a:font script="Telu" typeface="Gautami"/>
+        <a:font script="Taml" typeface="Latha"/>
+        <a:font script="Syrc" typeface="Estrangelo Edessa"/>
+        <a:font script="Orya" typeface="Kalinga"/>
+        <a:font script="Mlym" typeface="Kartika"/>
+        <a:font script="Laoo" typeface="DokChampa"/>
+        <a:font script="Sinh" typeface="Iskoola Pota"/>
+        <a:font script="Mong" typeface="Mongolian Baiti"/>
+        <a:font script="Viet" typeface="Times New Roman"/>
+        <a:font script="Uigh" typeface="Microsoft Uighur"/>
+        <a:font script="Geor" typeface="Sylfaen"/>
+        <a:font script="Armn" typeface="Arial"/>
+        <a:font script="Bugi" typeface="Leelawadee UI"/>
+        <a:font script="Bopo" typeface="Microsoft JhengHei"/>
+        <a:font script="Java" typeface="Javanese Text"/>
+        <a:font script="Lisu" typeface="Segoe UI"/>
+        <a:font script="Mymr" typeface="Myanmar Text"/>
+        <a:font script="Nkoo" typeface="Ebrima"/>
+        <a:font script="Olck" typeface="Nirmala UI"/>
+        <a:font script="Osma" typeface="Ebrima"/>
+        <a:font script="Phag" typeface="Phagspa"/>
+        <a:font script="Syrn" typeface="Estrangelo Edessa"/>
+        <a:font script="Syrj" typeface="Estrangelo Edessa"/>
+        <a:font script="Syre" typeface="Estrangelo Edessa"/>
+        <a:font script="Sora" typeface="Nirmala UI"/>
+        <a:font script="Tale" typeface="Microsoft Tai Le"/>
+        <a:font script="Talu" typeface="Microsoft New Tai Lue"/>
+        <a:font script="Tfng" typeface="Ebrima"/>
+      </a:majorFont>
+      <a:minorFont>
+        <a:latin typeface="Calibri" panose="020F0502020204030204"/>
+        <a:ea typeface=""/>
+        <a:cs typeface=""/>
+        <a:font script="Jpan" typeface="游明朝"/>
+        <a:font script="Hang" typeface="맑은 고딕"/>
+        <a:font script="Hans" typeface="等线"/>
+        <a:font script="Hant" typeface="新細明體"/>
+        <a:font script="Arab" typeface="Arial"/>
+        <a:font script="Hebr" typeface="Arial"/>
+        <a:font script="Thai" typeface="Cordia New"/>
+        <a:font script="Ethi" typeface="Nyala"/>
+        <a:font script="Beng" typeface="Vrinda"/>
+        <a:font script="Gujr" typeface="Shruti"/>
+        <a:font script="Khmr" typeface="DaunPenh"/>
+        <a:font script="Knda" typeface="Tunga"/>
+        <a:font script="Guru" typeface="Raavi"/>
+        <a:font script="Cans" typeface="Euphemia"/>
+        <a:font script="Cher" typeface="Plantagenet Cherokee"/>
+        <a:font script="Yiii" typeface="Microsoft Yi Baiti"/>
+        <a:font script="Tibt" typeface="Microsoft Himalaya"/>
+        <a:font script="Thaa" typeface="MV Boli"/>
+        <a:font script="Deva" typeface="Mangal"/>
+        <a:font script="Telu" typeface="Gautami"/>
+        <a:font script="Taml" typeface="Latha"/>
+        <a:font script="Syrc" typeface="Estrangelo Edessa"/>
+        <a:font script="Orya" typeface="Kalinga"/>
+        <a:font script="Mlym" typeface="Kartika"/>
+        <a:font script="Laoo" typeface="DokChampa"/>
+        <a:font script="Sinh" typeface="Iskoola Pota"/>
+        <a:font script="Mong" typeface="Mongolian Baiti"/>
+        <a:font script="Viet" typeface="Arial"/>
+        <a:font script="Uigh" typeface="Microsoft Uighur"/>
+        <a:font script="Geor" typeface="Sylfaen"/>
+        <a:font script="Armn" typeface="Arial"/>
+        <a:font script="Bugi" typeface="Leelawadee UI"/>
+        <a:font script="Bopo" typeface="Microsoft JhengHei"/>
+        <a:font script="Java" typeface="Javanese Text"/>
+        <a:font script="Lisu" typeface="Segoe UI"/>
+        <a:font script="Mymr" typeface="Myanmar Text"/>
+        <a:font script="Nkoo" typeface="Ebrima"/>
+        <a:font script="Olck" typeface="Nirmala UI"/>
+        <a:font script="Osma" typeface="Ebrima"/>
+        <a:font script="Phag" typeface="Phagspa"/>
+        <a:font script="Syrn" typeface="Estrangelo Edessa"/>
+        <a:font script="Syrj" typeface="Estrangelo Edessa"/>
+        <a:font script="Syre" typeface="Estrangelo Edessa"/>
+        <a:font script="Sora" typeface="Nirmala UI"/>
+        <a:font script="Tale" typeface="Microsoft Tai Le"/>
+        <a:font script="Talu" typeface="Microsoft New Tai Lue"/>
+        <a:font script="Tfng" typeface="Ebrima"/>
+      </a:minorFont>
+    </a:fontScheme>
+    <a:fmtScheme name="Office">
+      <a:fillStyleLst>
+        <a:solidFill>
+          <a:schemeClr val="phClr"/>
+        </a:solidFill>
+        <a:gradFill rotWithShape="true">
+          <a:gsLst>
+            <a:gs pos="0">
+              <a:schemeClr val="phClr">
+                <a:lumMod val="110000"/>
+                <a:satMod val="105000"/>
+                <a:tint val="67000"/>
+              </a:schemeClr>
+            </a:gs>
+            <a:gs pos="50000">
+              <a:schemeClr val="phClr">
+                <a:lumMod val="105000"/>
+                <a:satMod val="103000"/>
+                <a:tint val="73000"/>
+              </a:schemeClr>
+            </a:gs>
+            <a:gs pos="100000">
+              <a:schemeClr val="phClr">
+                <a:lumMod val="105000"/>
+                <a:satMod val="109000"/>
+                <a:tint val="81000"/>
+              </a:schemeClr>
+            </a:gs>
+          </a:gsLst>
+          <a:lin ang="5400000" scaled="false"/>
+        </a:gradFill>
+        <a:gradFill rotWithShape="true">
+          <a:gsLst>
+            <a:gs pos="0">
+              <a:schemeClr val="phClr">
+                <a:satMod val="103000"/>
+                <a:lumMod val="102000"/>
+                <a:tint val="94000"/>
+              </a:schemeClr>
+            </a:gs>
+            <a:gs pos="50000">
+              <a:schemeClr val="phClr">
+                <a:satMod val="110000"/>
+                <a:lumMod val="100000"/>
+                <a:shade val="100000"/>
+              </a:schemeClr>
+            </a:gs>
+            <a:gs pos="100000">
+              <a:schemeClr val="phClr">
+                <a:lumMod val="99000"/>
+                <a:satMod val="120000"/>
+                <a:shade val="78000"/>
+              </a:schemeClr>
+            </a:gs>
+          </a:gsLst>
+          <a:lin ang="5400000" scaled="false"/>
+        </a:gradFill>
+      </a:fillStyleLst>
+      <a:lnStyleLst>
+        <a:ln w="6350" cap="flat" cmpd="sng" algn="ctr">
+          <a:solidFill>
+            <a:schemeClr val="phClr"/>
+          </a:solidFill>
+          <a:prstDash val="solid"/>
+          <a:miter lim="800000"/>
+        </a:ln>
+        <a:ln w="12700" cap="flat" cmpd="sng" algn="ctr">
+          <a:solidFill>
+            <a:schemeClr val="phClr"/>
+          </a:solidFill>
+          <a:prstDash val="solid"/>
+          <a:miter lim="800000"/>
+        </a:ln>
+        <a:ln w="19050" cap="flat" cmpd="sng" algn="ctr">
+          <a:solidFill>
+            <a:schemeClr val="phClr"/>
+          </a:solidFill>
+          <a:prstDash val="solid"/>
+          <a:miter lim="800000"/>
+        </a:ln>
+      </a:lnStyleLst>
+      <a:effectStyleLst>
+        <a:effectStyle>
+          <a:effectLst/>
+        </a:effectStyle>
+        <a:effectStyle>
+          <a:effectLst/>
+        </a:effectStyle>
+        <a:effectStyle>
+          <a:effectLst>
+            <a:outerShdw blurRad="57150" dist="19050" dir="5400000" algn="ctr" rotWithShape="false">
+              <a:srgbClr val="000000">
+                <a:alpha val="63000"/>
+              </a:srgbClr>
+            </a:outerShdw>
+          </a:effectLst>
+        </a:effectStyle>
+      </a:effectStyleLst>
+      <a:bgFillStyleLst>
+        <a:solidFill>
+          <a:schemeClr val="phClr"/>
+        </a:solidFill>
+        <a:solidFill>
+          <a:schemeClr val="phClr">
+            <a:tint val="95000"/>
+            <a:satMod val="170000"/>
+          </a:schemeClr>
+        </a:solidFill>
+        <a:gradFill rotWithShape="true">
+          <a:gsLst>
+            <a:gs pos="0">
+              <a:schemeClr val="phClr">
+                <a:tint val="93000"/>
+                <a:satMod val="150000"/>
+                <a:shade val="98000"/>
+                <a:lumMod val="102000"/>
+              </a:schemeClr>
+            </a:gs>
+            <a:gs pos="50000">
+              <a:schemeClr val="phClr">
+                <a:tint val="98000"/>
+                <a:satMod val="130000"/>
+                <a:shade val="90000"/>
+                <a:lumMod val="103000"/>
+              </a:schemeClr>
+            </a:gs>
+            <a:gs pos="100000">
+              <a:schemeClr val="phClr">
+                <a:shade val="63000"/>
+                <a:satMod val="120000"/>
+              </a:schemeClr>
+            </a:gs>
+          </a:gsLst>
+          <a:lin ang="5400000" scaled="false"/>
+        </a:gradFill>
+      </a:bgFillStyleLst>
+    </a:fmtScheme>
+  </a:themeElements>
+  <a:objectDefaults/>
+  <a:extraClrSchemeLst/>
+</a:theme>
 </file>
</xml_diff>